<commit_message>
Update GitHub Destop User Mannul.docx
</commit_message>
<xml_diff>
--- a/GitHub Destop User Mannul.docx
+++ b/GitHub Destop User Mannul.docx
@@ -51,10 +51,7 @@
         <w:jc w:val="left"/>
       </w:pPr>
       <w:r>
-        <w:t xml:space="preserve">select a </w:t>
-      </w:r>
-      <w:r>
-        <w:t>repository</w:t>
+        <w:t>select a repository</w:t>
       </w:r>
     </w:p>
     <w:p>
@@ -90,152 +87,14 @@
         <w:jc w:val="left"/>
       </w:pPr>
       <w:r>
+        <w:rPr>
+          <w:noProof/>
+        </w:rPr>
         <w:drawing>
           <wp:inline distT="0" distB="0" distL="0" distR="0" wp14:anchorId="2E5D9E4C" wp14:editId="303B2624">
             <wp:extent cx="5731510" cy="3267710"/>
             <wp:effectExtent l="0" t="0" r="2540" b="8890"/>
             <wp:docPr id="1" name="Picture 1"/>
-            <wp:cNvGraphicFramePr>
-              <a:graphicFrameLocks xmlns:a="http://schemas.openxmlformats.org/drawingml/2006/main" noChangeAspect="1"/>
-            </wp:cNvGraphicFramePr>
-            <a:graphic xmlns:a="http://schemas.openxmlformats.org/drawingml/2006/main">
-              <a:graphicData uri="http://schemas.openxmlformats.org/drawingml/2006/picture">
-                <pic:pic xmlns:pic="http://schemas.openxmlformats.org/drawingml/2006/picture">
-                  <pic:nvPicPr>
-                    <pic:cNvPr id="1" name=""/>
-                    <pic:cNvPicPr/>
-                  </pic:nvPicPr>
-                  <pic:blipFill>
-                    <a:blip r:embed="rId5"/>
-                    <a:stretch>
-                      <a:fillRect/>
-                    </a:stretch>
-                  </pic:blipFill>
-                  <pic:spPr>
-                    <a:xfrm>
-                      <a:off x="0" y="0"/>
-                      <a:ext cx="5731510" cy="3267710"/>
-                    </a:xfrm>
-                    <a:prstGeom prst="rect">
-                      <a:avLst/>
-                    </a:prstGeom>
-                  </pic:spPr>
-                </pic:pic>
-              </a:graphicData>
-            </a:graphic>
-          </wp:inline>
-        </w:drawing>
-      </w:r>
-    </w:p>
-    <w:p>
-      <w:pPr>
-        <w:pStyle w:val="ListParagraph"/>
-        <w:ind w:left="0"/>
-        <w:jc w:val="left"/>
-      </w:pPr>
-      <w:r>
-        <w:drawing>
-          <wp:inline distT="0" distB="0" distL="0" distR="0" wp14:anchorId="3C104FCA" wp14:editId="7251AFBE">
-            <wp:extent cx="5731510" cy="3226435"/>
-            <wp:effectExtent l="0" t="0" r="2540" b="0"/>
-            <wp:docPr id="2" name="Picture 2"/>
-            <wp:cNvGraphicFramePr>
-              <a:graphicFrameLocks xmlns:a="http://schemas.openxmlformats.org/drawingml/2006/main" noChangeAspect="1"/>
-            </wp:cNvGraphicFramePr>
-            <a:graphic xmlns:a="http://schemas.openxmlformats.org/drawingml/2006/main">
-              <a:graphicData uri="http://schemas.openxmlformats.org/drawingml/2006/picture">
-                <pic:pic xmlns:pic="http://schemas.openxmlformats.org/drawingml/2006/picture">
-                  <pic:nvPicPr>
-                    <pic:cNvPr id="1" name=""/>
-                    <pic:cNvPicPr/>
-                  </pic:nvPicPr>
-                  <pic:blipFill>
-                    <a:blip r:embed="rId6"/>
-                    <a:stretch>
-                      <a:fillRect/>
-                    </a:stretch>
-                  </pic:blipFill>
-                  <pic:spPr>
-                    <a:xfrm>
-                      <a:off x="0" y="0"/>
-                      <a:ext cx="5731510" cy="3226435"/>
-                    </a:xfrm>
-                    <a:prstGeom prst="rect">
-                      <a:avLst/>
-                    </a:prstGeom>
-                  </pic:spPr>
-                </pic:pic>
-              </a:graphicData>
-            </a:graphic>
-          </wp:inline>
-        </w:drawing>
-      </w:r>
-    </w:p>
-    <w:p>
-      <w:pPr>
-        <w:pStyle w:val="ListParagraph"/>
-        <w:numPr>
-          <w:ilvl w:val="0"/>
-          <w:numId w:val="2"/>
-        </w:numPr>
-        <w:jc w:val="left"/>
-      </w:pPr>
-      <w:r>
-        <w:rPr>
-          <w:rFonts w:ascii="DengXian" w:eastAsia="DengXian" w:hAnsi="DengXian" w:hint="eastAsia"/>
-          <w:lang w:eastAsia="zh-CN"/>
-        </w:rPr>
-        <w:t>切换</w:t>
-      </w:r>
-      <w:r>
-        <w:t>Current</w:t>
-      </w:r>
-      <w:r>
-        <w:t xml:space="preserve"> </w:t>
-      </w:r>
-      <w:r>
-        <w:t>repository</w:t>
-      </w:r>
-      <w:r>
-        <w:br/>
-      </w:r>
-      <w:r>
-        <w:t>Current</w:t>
-      </w:r>
-      <w:r>
-        <w:t xml:space="preserve"> </w:t>
-      </w:r>
-      <w:r>
-        <w:t>repository</w:t>
-      </w:r>
-      <w:r>
-        <w:rPr>
-          <w:rFonts w:ascii="DengXian" w:eastAsia="DengXian" w:hAnsi="DengXian" w:hint="eastAsia"/>
-          <w:lang w:eastAsia="zh-CN"/>
-        </w:rPr>
-        <w:t>右侧</w:t>
-      </w:r>
-      <w:r>
-        <w:rPr>
-          <w:rFonts w:ascii="Microsoft YaHei" w:eastAsia="Microsoft YaHei" w:hAnsi="Microsoft YaHei" w:cs="Microsoft YaHei" w:hint="eastAsia"/>
-          <w:lang w:eastAsia="zh-CN"/>
-        </w:rPr>
-        <w:t>选择黑色三角符号-&gt;选择需要切换的workspace</w:t>
-      </w:r>
-    </w:p>
-    <w:p>
-      <w:pPr>
-        <w:pStyle w:val="ListParagraph"/>
-        <w:ind w:left="0"/>
-        <w:jc w:val="left"/>
-      </w:pPr>
-      <w:r>
-        <w:lastRenderedPageBreak/>
-        <w:drawing>
-          <wp:inline distT="0" distB="0" distL="0" distR="0" wp14:anchorId="38934210" wp14:editId="3C72DBF0">
-            <wp:extent cx="5731510" cy="3239135"/>
-            <wp:effectExtent l="0" t="0" r="2540" b="0"/>
-            <wp:docPr id="3" name="Picture 3"/>
             <wp:cNvGraphicFramePr>
               <a:graphicFrameLocks xmlns:a="http://schemas.openxmlformats.org/drawingml/2006/main" noChangeAspect="1"/>
             </wp:cNvGraphicFramePr>
@@ -255,7 +114,7 @@
                   <pic:spPr>
                     <a:xfrm>
                       <a:off x="0" y="0"/>
-                      <a:ext cx="5731510" cy="3239135"/>
+                      <a:ext cx="5731510" cy="3267710"/>
                     </a:xfrm>
                     <a:prstGeom prst="rect">
                       <a:avLst/>
@@ -275,11 +134,14 @@
         <w:jc w:val="left"/>
       </w:pPr>
       <w:r>
+        <w:rPr>
+          <w:noProof/>
+        </w:rPr>
         <w:drawing>
-          <wp:inline distT="0" distB="0" distL="0" distR="0" wp14:anchorId="638D823C" wp14:editId="2425717B">
-            <wp:extent cx="5731510" cy="3242310"/>
+          <wp:inline distT="0" distB="0" distL="0" distR="0" wp14:anchorId="3C104FCA" wp14:editId="7251AFBE">
+            <wp:extent cx="5731510" cy="3226435"/>
             <wp:effectExtent l="0" t="0" r="2540" b="0"/>
-            <wp:docPr id="4" name="Picture 4"/>
+            <wp:docPr id="2" name="Picture 2"/>
             <wp:cNvGraphicFramePr>
               <a:graphicFrameLocks xmlns:a="http://schemas.openxmlformats.org/drawingml/2006/main" noChangeAspect="1"/>
             </wp:cNvGraphicFramePr>
@@ -299,7 +161,7 @@
                   <pic:spPr>
                     <a:xfrm>
                       <a:off x="0" y="0"/>
-                      <a:ext cx="5731510" cy="3242310"/>
+                      <a:ext cx="5731510" cy="3226435"/>
                     </a:xfrm>
                     <a:prstGeom prst="rect">
                       <a:avLst/>
@@ -323,10 +185,43 @@
       </w:pPr>
       <w:r>
         <w:rPr>
+          <w:rFonts w:ascii="DengXian" w:eastAsia="DengXian" w:hAnsi="DengXian" w:hint="eastAsia"/>
+          <w:lang w:eastAsia="zh-CN"/>
+        </w:rPr>
+        <w:t>切换</w:t>
+      </w:r>
+      <w:r>
+        <w:t>Current</w:t>
+      </w:r>
+      <w:r>
+        <w:t xml:space="preserve"> </w:t>
+      </w:r>
+      <w:r>
+        <w:t>repository</w:t>
+      </w:r>
+      <w:r>
+        <w:br/>
+        <w:t>Current</w:t>
+      </w:r>
+      <w:r>
+        <w:t xml:space="preserve"> </w:t>
+      </w:r>
+      <w:r>
+        <w:t>repository</w:t>
+      </w:r>
+      <w:r>
+        <w:rPr>
+          <w:rFonts w:ascii="DengXian" w:eastAsia="DengXian" w:hAnsi="DengXian" w:hint="eastAsia"/>
+          <w:lang w:eastAsia="zh-CN"/>
+        </w:rPr>
+        <w:t>右侧</w:t>
+      </w:r>
+      <w:r>
+        <w:rPr>
           <w:rFonts w:ascii="Microsoft YaHei" w:eastAsia="Microsoft YaHei" w:hAnsi="Microsoft YaHei" w:cs="Microsoft YaHei" w:hint="eastAsia"/>
           <w:lang w:eastAsia="zh-CN"/>
         </w:rPr>
-        <w:t>查看git仓库版本详细变更记录</w:t>
+        <w:t>选择黑色三角符号-&gt;选择需要切换的workspace</w:t>
       </w:r>
     </w:p>
     <w:p>
@@ -336,12 +231,15 @@
         <w:jc w:val="left"/>
       </w:pPr>
       <w:r>
+        <w:rPr>
+          <w:noProof/>
+        </w:rPr>
         <w:lastRenderedPageBreak/>
         <w:drawing>
-          <wp:inline distT="0" distB="0" distL="0" distR="0" wp14:anchorId="60C9755E" wp14:editId="58E2C12B">
-            <wp:extent cx="5731510" cy="3231515"/>
-            <wp:effectExtent l="0" t="0" r="2540" b="6985"/>
-            <wp:docPr id="5" name="Picture 5"/>
+          <wp:inline distT="0" distB="0" distL="0" distR="0" wp14:anchorId="38934210" wp14:editId="3C72DBF0">
+            <wp:extent cx="5731510" cy="3239135"/>
+            <wp:effectExtent l="0" t="0" r="2540" b="0"/>
+            <wp:docPr id="3" name="Picture 3"/>
             <wp:cNvGraphicFramePr>
               <a:graphicFrameLocks xmlns:a="http://schemas.openxmlformats.org/drawingml/2006/main" noChangeAspect="1"/>
             </wp:cNvGraphicFramePr>
@@ -361,7 +259,7 @@
                   <pic:spPr>
                     <a:xfrm>
                       <a:off x="0" y="0"/>
-                      <a:ext cx="5731510" cy="3231515"/>
+                      <a:ext cx="5731510" cy="3239135"/>
                     </a:xfrm>
                     <a:prstGeom prst="rect">
                       <a:avLst/>
@@ -377,39 +275,18 @@
     <w:p>
       <w:pPr>
         <w:pStyle w:val="ListParagraph"/>
-        <w:ind w:left="360"/>
-        <w:jc w:val="left"/>
-      </w:pPr>
-    </w:p>
-    <w:p>
-      <w:pPr>
-        <w:pStyle w:val="ListParagraph"/>
-        <w:numPr>
-          <w:ilvl w:val="0"/>
-          <w:numId w:val="2"/>
-        </w:numPr>
-        <w:jc w:val="left"/>
-      </w:pPr>
-      <w:r>
-        <w:rPr>
-          <w:rFonts w:ascii="Microsoft YaHei" w:eastAsia="Microsoft YaHei" w:hAnsi="Microsoft YaHei" w:cs="Microsoft YaHei" w:hint="eastAsia"/>
-          <w:lang w:eastAsia="zh-CN"/>
-        </w:rPr>
-        <w:t>创建本地工作分支</w:t>
-      </w:r>
-    </w:p>
-    <w:p>
-      <w:pPr>
-        <w:pStyle w:val="ListParagraph"/>
         <w:ind w:left="0"/>
         <w:jc w:val="left"/>
       </w:pPr>
       <w:r>
+        <w:rPr>
+          <w:noProof/>
+        </w:rPr>
         <w:drawing>
-          <wp:inline distT="0" distB="0" distL="0" distR="0" wp14:anchorId="7D72A8C3" wp14:editId="7B95C519">
-            <wp:extent cx="5731510" cy="3244850"/>
+          <wp:inline distT="0" distB="0" distL="0" distR="0" wp14:anchorId="638D823C" wp14:editId="2425717B">
+            <wp:extent cx="5731510" cy="3242310"/>
             <wp:effectExtent l="0" t="0" r="2540" b="0"/>
-            <wp:docPr id="7" name="Picture 7"/>
+            <wp:docPr id="4" name="Picture 4"/>
             <wp:cNvGraphicFramePr>
               <a:graphicFrameLocks xmlns:a="http://schemas.openxmlformats.org/drawingml/2006/main" noChangeAspect="1"/>
             </wp:cNvGraphicFramePr>
@@ -429,7 +306,7 @@
                   <pic:spPr>
                     <a:xfrm>
                       <a:off x="0" y="0"/>
-                      <a:ext cx="5731510" cy="3244850"/>
+                      <a:ext cx="5731510" cy="3242310"/>
                     </a:xfrm>
                     <a:prstGeom prst="rect">
                       <a:avLst/>
@@ -445,16 +322,39 @@
     <w:p>
       <w:pPr>
         <w:pStyle w:val="ListParagraph"/>
+        <w:numPr>
+          <w:ilvl w:val="0"/>
+          <w:numId w:val="2"/>
+        </w:numPr>
+        <w:jc w:val="left"/>
+        <w:rPr>
+          <w:lang w:eastAsia="zh-CN"/>
+        </w:rPr>
+      </w:pPr>
+      <w:r>
+        <w:rPr>
+          <w:rFonts w:ascii="Microsoft YaHei" w:eastAsia="Microsoft YaHei" w:hAnsi="Microsoft YaHei" w:cs="Microsoft YaHei" w:hint="eastAsia"/>
+          <w:lang w:eastAsia="zh-CN"/>
+        </w:rPr>
+        <w:t>查看git仓库版本详细变更记录</w:t>
+      </w:r>
+    </w:p>
+    <w:p>
+      <w:pPr>
+        <w:pStyle w:val="ListParagraph"/>
         <w:ind w:left="0"/>
         <w:jc w:val="left"/>
       </w:pPr>
       <w:r>
+        <w:rPr>
+          <w:noProof/>
+        </w:rPr>
         <w:lastRenderedPageBreak/>
         <w:drawing>
-          <wp:inline distT="0" distB="0" distL="0" distR="0" wp14:anchorId="2B55D47E" wp14:editId="7C59C072">
-            <wp:extent cx="5731510" cy="3239770"/>
-            <wp:effectExtent l="0" t="0" r="2540" b="0"/>
-            <wp:docPr id="8" name="Picture 8"/>
+          <wp:inline distT="0" distB="0" distL="0" distR="0" wp14:anchorId="60C9755E" wp14:editId="58E2C12B">
+            <wp:extent cx="5731510" cy="3231515"/>
+            <wp:effectExtent l="0" t="0" r="2540" b="6985"/>
+            <wp:docPr id="5" name="Picture 5"/>
             <wp:cNvGraphicFramePr>
               <a:graphicFrameLocks xmlns:a="http://schemas.openxmlformats.org/drawingml/2006/main" noChangeAspect="1"/>
             </wp:cNvGraphicFramePr>
@@ -474,7 +374,7 @@
                   <pic:spPr>
                     <a:xfrm>
                       <a:off x="0" y="0"/>
-                      <a:ext cx="5731510" cy="3239770"/>
+                      <a:ext cx="5731510" cy="3231515"/>
                     </a:xfrm>
                     <a:prstGeom prst="rect">
                       <a:avLst/>
@@ -490,7 +390,7 @@
     <w:p>
       <w:pPr>
         <w:pStyle w:val="ListParagraph"/>
-        <w:ind w:left="0"/>
+        <w:ind w:left="360"/>
         <w:jc w:val="left"/>
       </w:pPr>
     </w:p>
@@ -511,28 +411,7 @@
           <w:rFonts w:ascii="Microsoft YaHei" w:eastAsia="Microsoft YaHei" w:hAnsi="Microsoft YaHei" w:cs="Microsoft YaHei" w:hint="eastAsia"/>
           <w:lang w:eastAsia="zh-CN"/>
         </w:rPr>
-        <w:t>查看</w:t>
-      </w:r>
-      <w:r>
-        <w:rPr>
-          <w:rFonts w:ascii="Microsoft YaHei" w:eastAsia="Microsoft YaHei" w:hAnsi="Microsoft YaHei" w:cs="Microsoft YaHei" w:hint="eastAsia"/>
-          <w:lang w:eastAsia="zh-CN"/>
-        </w:rPr>
-        <w:t>本地</w:t>
-      </w:r>
-      <w:r>
-        <w:rPr>
-          <w:rFonts w:ascii="Microsoft YaHei" w:eastAsia="Microsoft YaHei" w:hAnsi="Microsoft YaHei" w:cs="Microsoft YaHei" w:hint="eastAsia"/>
-          <w:lang w:eastAsia="zh-CN"/>
-        </w:rPr>
-        <w:t>版本</w:t>
-      </w:r>
-      <w:r>
-        <w:rPr>
-          <w:rFonts w:ascii="Microsoft YaHei" w:eastAsia="Microsoft YaHei" w:hAnsi="Microsoft YaHei" w:cs="Microsoft YaHei" w:hint="eastAsia"/>
-          <w:lang w:eastAsia="zh-CN"/>
-        </w:rPr>
-        <w:t>修改记录</w:t>
+        <w:t>查看本地版本修改记录</w:t>
       </w:r>
     </w:p>
     <w:p>
@@ -546,6 +425,7 @@
       </w:pPr>
       <w:r>
         <w:rPr>
+          <w:noProof/>
           <w:lang w:eastAsia="zh-CN"/>
         </w:rPr>
         <w:drawing>
@@ -616,6 +496,7 @@
       </w:pPr>
       <w:r>
         <w:rPr>
+          <w:noProof/>
           <w:lang w:eastAsia="zh-CN"/>
         </w:rPr>
         <w:lastRenderedPageBreak/>
@@ -665,6 +546,7 @@
       </w:pPr>
       <w:r>
         <w:rPr>
+          <w:noProof/>
           <w:lang w:eastAsia="zh-CN"/>
         </w:rPr>
         <w:drawing>
@@ -713,6 +595,7 @@
       </w:pPr>
       <w:r>
         <w:rPr>
+          <w:noProof/>
           <w:lang w:eastAsia="zh-CN"/>
         </w:rPr>
         <w:lastRenderedPageBreak/>
@@ -791,6 +674,7 @@
       </w:pPr>
       <w:r>
         <w:rPr>
+          <w:noProof/>
           <w:lang w:eastAsia="zh-CN"/>
         </w:rPr>
         <w:drawing>
@@ -841,6 +725,7 @@
       </w:pPr>
       <w:r>
         <w:rPr>
+          <w:noProof/>
           <w:lang w:eastAsia="zh-CN"/>
         </w:rPr>
         <w:lastRenderedPageBreak/>
@@ -892,6 +777,7 @@
       </w:pPr>
       <w:r>
         <w:rPr>
+          <w:noProof/>
           <w:lang w:eastAsia="zh-CN"/>
         </w:rPr>
         <w:drawing>
@@ -962,6 +848,7 @@
       </w:pPr>
       <w:r>
         <w:rPr>
+          <w:noProof/>
           <w:lang w:eastAsia="zh-CN"/>
         </w:rPr>
         <w:lastRenderedPageBreak/>
@@ -1033,6 +920,7 @@
       </w:pPr>
       <w:r>
         <w:rPr>
+          <w:noProof/>
           <w:lang w:eastAsia="zh-CN"/>
         </w:rPr>
         <w:drawing>
@@ -1088,6 +976,56 @@
     </w:sectPr>
   </w:body>
 </w:document>
+</file>
+
+<file path=word/endnotes.xml><?xml version="1.0" encoding="utf-8"?>
+<w:endnotes xmlns:wpc="http://schemas.microsoft.com/office/word/2010/wordprocessingCanvas" xmlns:cx="http://schemas.microsoft.com/office/drawing/2014/chartex" xmlns:cx1="http://schemas.microsoft.com/office/drawing/2015/9/8/chartex" xmlns:cx2="http://schemas.microsoft.com/office/drawing/2015/10/21/chartex" xmlns:cx3="http://schemas.microsoft.com/office/drawing/2016/5/9/chartex" xmlns:cx4="http://schemas.microsoft.com/office/drawing/2016/5/10/chartex" xmlns:cx5="http://schemas.microsoft.com/office/drawing/2016/5/11/chartex" xmlns:cx6="http://schemas.microsoft.com/office/drawing/2016/5/12/chartex" xmlns:cx7="http://schemas.microsoft.com/office/drawing/2016/5/13/chartex" xmlns:cx8="http://schemas.microsoft.com/office/drawing/2016/5/14/chartex" xmlns:mc="http://schemas.openxmlformats.org/markup-compatibility/2006" xmlns:aink="http://schemas.microsoft.com/office/drawing/2016/ink" xmlns:am3d="http://schemas.microsoft.com/office/drawing/2017/model3d" xmlns:o="urn:schemas-microsoft-com:office:office" xmlns:r="http://schemas.openxmlformats.org/officeDocument/2006/relationships" xmlns:m="http://schemas.openxmlformats.org/officeDocument/2006/math" xmlns:v="urn:schemas-microsoft-com:vml" xmlns:wp14="http://schemas.microsoft.com/office/word/2010/wordprocessingDrawing" xmlns:wp="http://schemas.openxmlformats.org/drawingml/2006/wordprocessingDrawing" xmlns:w10="urn:schemas-microsoft-com:office:word" xmlns:w="http://schemas.openxmlformats.org/wordprocessingml/2006/main" xmlns:w14="http://schemas.microsoft.com/office/word/2010/wordml" xmlns:w15="http://schemas.microsoft.com/office/word/2012/wordml" xmlns:w16cex="http://schemas.microsoft.com/office/word/2018/wordml/cex" xmlns:w16cid="http://schemas.microsoft.com/office/word/2016/wordml/cid" xmlns:w16="http://schemas.microsoft.com/office/word/2018/wordml" xmlns:w16sdtdh="http://schemas.microsoft.com/office/word/2020/wordml/sdtdatahash" xmlns:w16se="http://schemas.microsoft.com/office/word/2015/wordml/symex" xmlns:wpg="http://schemas.microsoft.com/office/word/2010/wordprocessingGroup" xmlns:wpi="http://schemas.microsoft.com/office/word/2010/wordprocessingInk" xmlns:wne="http://schemas.microsoft.com/office/word/2006/wordml" xmlns:wps="http://schemas.microsoft.com/office/word/2010/wordprocessingShape" mc:Ignorable="w14 w15 w16se w16cid w16 w16cex w16sdtdh wp14">
+  <w:endnote w:type="separator" w:id="-1">
+    <w:p>
+      <w:pPr>
+        <w:spacing w:after="0" w:line="240" w:lineRule="auto"/>
+      </w:pPr>
+      <w:r>
+        <w:separator/>
+      </w:r>
+    </w:p>
+  </w:endnote>
+  <w:endnote w:type="continuationSeparator" w:id="0">
+    <w:p>
+      <w:pPr>
+        <w:spacing w:after="0" w:line="240" w:lineRule="auto"/>
+      </w:pPr>
+      <w:r>
+        <w:continuationSeparator/>
+      </w:r>
+    </w:p>
+  </w:endnote>
+</w:endnotes>
+</file>
+
+<file path=word/footnotes.xml><?xml version="1.0" encoding="utf-8"?>
+<w:footnotes xmlns:wpc="http://schemas.microsoft.com/office/word/2010/wordprocessingCanvas" xmlns:cx="http://schemas.microsoft.com/office/drawing/2014/chartex" xmlns:cx1="http://schemas.microsoft.com/office/drawing/2015/9/8/chartex" xmlns:cx2="http://schemas.microsoft.com/office/drawing/2015/10/21/chartex" xmlns:cx3="http://schemas.microsoft.com/office/drawing/2016/5/9/chartex" xmlns:cx4="http://schemas.microsoft.com/office/drawing/2016/5/10/chartex" xmlns:cx5="http://schemas.microsoft.com/office/drawing/2016/5/11/chartex" xmlns:cx6="http://schemas.microsoft.com/office/drawing/2016/5/12/chartex" xmlns:cx7="http://schemas.microsoft.com/office/drawing/2016/5/13/chartex" xmlns:cx8="http://schemas.microsoft.com/office/drawing/2016/5/14/chartex" xmlns:mc="http://schemas.openxmlformats.org/markup-compatibility/2006" xmlns:aink="http://schemas.microsoft.com/office/drawing/2016/ink" xmlns:am3d="http://schemas.microsoft.com/office/drawing/2017/model3d" xmlns:o="urn:schemas-microsoft-com:office:office" xmlns:r="http://schemas.openxmlformats.org/officeDocument/2006/relationships" xmlns:m="http://schemas.openxmlformats.org/officeDocument/2006/math" xmlns:v="urn:schemas-microsoft-com:vml" xmlns:wp14="http://schemas.microsoft.com/office/word/2010/wordprocessingDrawing" xmlns:wp="http://schemas.openxmlformats.org/drawingml/2006/wordprocessingDrawing" xmlns:w10="urn:schemas-microsoft-com:office:word" xmlns:w="http://schemas.openxmlformats.org/wordprocessingml/2006/main" xmlns:w14="http://schemas.microsoft.com/office/word/2010/wordml" xmlns:w15="http://schemas.microsoft.com/office/word/2012/wordml" xmlns:w16cex="http://schemas.microsoft.com/office/word/2018/wordml/cex" xmlns:w16cid="http://schemas.microsoft.com/office/word/2016/wordml/cid" xmlns:w16="http://schemas.microsoft.com/office/word/2018/wordml" xmlns:w16sdtdh="http://schemas.microsoft.com/office/word/2020/wordml/sdtdatahash" xmlns:w16se="http://schemas.microsoft.com/office/word/2015/wordml/symex" xmlns:wpg="http://schemas.microsoft.com/office/word/2010/wordprocessingGroup" xmlns:wpi="http://schemas.microsoft.com/office/word/2010/wordprocessingInk" xmlns:wne="http://schemas.microsoft.com/office/word/2006/wordml" xmlns:wps="http://schemas.microsoft.com/office/word/2010/wordprocessingShape" mc:Ignorable="w14 w15 w16se w16cid w16 w16cex w16sdtdh wp14">
+  <w:footnote w:type="separator" w:id="-1">
+    <w:p>
+      <w:pPr>
+        <w:spacing w:after="0" w:line="240" w:lineRule="auto"/>
+      </w:pPr>
+      <w:r>
+        <w:separator/>
+      </w:r>
+    </w:p>
+  </w:footnote>
+  <w:footnote w:type="continuationSeparator" w:id="0">
+    <w:p>
+      <w:pPr>
+        <w:spacing w:after="0" w:line="240" w:lineRule="auto"/>
+      </w:pPr>
+      <w:r>
+        <w:continuationSeparator/>
+      </w:r>
+    </w:p>
+  </w:footnote>
+</w:footnotes>
 </file>
 
 <file path=word/numbering.xml><?xml version="1.0" encoding="utf-8"?>
@@ -1812,6 +1750,50 @@
       <w:contextualSpacing/>
     </w:pPr>
   </w:style>
+  <w:style w:type="paragraph" w:styleId="Header">
+    <w:name w:val="header"/>
+    <w:basedOn w:val="Normal"/>
+    <w:link w:val="HeaderChar"/>
+    <w:uiPriority w:val="99"/>
+    <w:unhideWhenUsed/>
+    <w:rsid w:val="00FF0D75"/>
+    <w:pPr>
+      <w:tabs>
+        <w:tab w:val="center" w:pos="4513"/>
+        <w:tab w:val="right" w:pos="9026"/>
+      </w:tabs>
+      <w:spacing w:after="0" w:line="240" w:lineRule="auto"/>
+    </w:pPr>
+  </w:style>
+  <w:style w:type="character" w:customStyle="1" w:styleId="HeaderChar">
+    <w:name w:val="Header Char"/>
+    <w:basedOn w:val="DefaultParagraphFont"/>
+    <w:link w:val="Header"/>
+    <w:uiPriority w:val="99"/>
+    <w:rsid w:val="00FF0D75"/>
+  </w:style>
+  <w:style w:type="paragraph" w:styleId="Footer">
+    <w:name w:val="footer"/>
+    <w:basedOn w:val="Normal"/>
+    <w:link w:val="FooterChar"/>
+    <w:uiPriority w:val="99"/>
+    <w:unhideWhenUsed/>
+    <w:rsid w:val="00FF0D75"/>
+    <w:pPr>
+      <w:tabs>
+        <w:tab w:val="center" w:pos="4513"/>
+        <w:tab w:val="right" w:pos="9026"/>
+      </w:tabs>
+      <w:spacing w:after="0" w:line="240" w:lineRule="auto"/>
+    </w:pPr>
+  </w:style>
+  <w:style w:type="character" w:customStyle="1" w:styleId="FooterChar">
+    <w:name w:val="Footer Char"/>
+    <w:basedOn w:val="DefaultParagraphFont"/>
+    <w:link w:val="Footer"/>
+    <w:uiPriority w:val="99"/>
+    <w:rsid w:val="00FF0D75"/>
+  </w:style>
 </w:styles>
 </file>
 

</xml_diff>